<commit_message>
tde 3 qualidade software
</commit_message>
<xml_diff>
--- a/3semestre/verificacao/errosEmJava/erros-Java.docx
+++ b/3semestre/verificacao/errosEmJava/erros-Java.docx
@@ -37,15 +37,7 @@
         </w:numPr>
       </w:pPr>
       <w:r>
-        <w:t xml:space="preserve">A condição i = 0 na primeira iteração para o loop, pois o índice é igualado a 0, e retornamos </w:t>
-      </w:r>
-      <w:proofErr w:type="gramStart"/>
-      <w:r>
-        <w:t>a</w:t>
-      </w:r>
-      <w:proofErr w:type="gramEnd"/>
-      <w:r>
-        <w:t xml:space="preserve"> primeira posição, o que é errado. Para arrumar, i deve ser igualado ao </w:t>
+        <w:t xml:space="preserve">A condição i = 0 na primeira iteração para o loop, pois o índice é igualado a 0, e retornamos a primeira posição, o que é errado. Para arrumar, i deve ser igualado ao </w:t>
       </w:r>
       <w:r>
         <w:t>último</w:t>
@@ -87,17 +79,10 @@
         </w:numPr>
       </w:pPr>
       <w:r>
-        <w:t xml:space="preserve">A condição x[i] % 2 == 1 causa o erro, pois não satisfaz números negativos. O correto seria usar x[i] % </w:t>
-      </w:r>
-      <w:proofErr w:type="gramStart"/>
-      <w:r>
-        <w:t>2 !</w:t>
-      </w:r>
-      <w:proofErr w:type="gramEnd"/>
-      <w:r>
-        <w:t>= 0, pois garante que o número é ímpar de qualquer jeito.</w:t>
+        <w:t>A condição x[i] % 2 == 1 causa o erro, pois não satisfaz números negativos. O correto seria usar x[i] % 2 != 0, pois garante que o número é ímpar de qualquer jeito.</w:t>
       </w:r>
     </w:p>
+    <w:p/>
     <w:sectPr>
       <w:pgSz w:w="11906" w:h="16838"/>
       <w:pgMar w:top="1417" w:right="1701" w:bottom="1417" w:left="1701" w:header="708" w:footer="708" w:gutter="0"/>

</xml_diff>